<commit_message>
1.1.1 VERSION C  Added Compatibility for Reference Resumes in Editable Window
</commit_message>
<xml_diff>
--- a/Sisyphus/templates/cv_template_v_w_p.docx
+++ b/Sisyphus/templates/cv_template_v_w_p.docx
@@ -73,8 +73,8 @@
         </w:tblCellMar>
       </w:tblPr>
       <w:tblGrid>
-        <w:gridCol w:w="9149"/>
-        <w:gridCol w:w="2730"/>
+        <w:gridCol w:w="1980"/>
+        <w:gridCol w:w="8534"/>
       </w:tblGrid>
       <w:tr>
         <w:trPr>
@@ -82,7 +82,8 @@
         </w:trPr>
         <w:tc>
           <w:tcPr>
-            <w:tcW w:w="9149" w:type="dxa"/>
+            <w:tcW w:w="1980" w:type="dxa"/>
+            <w:vMerge w:val="restart"/>
             <w:tcBorders/>
           </w:tcPr>
           <w:p>
@@ -90,6 +91,7 @@
               <w:pStyle w:val="BodyText"/>
               <w:bidi w:val="0"/>
               <w:spacing w:lineRule="auto" w:line="240" w:before="57" w:after="57"/>
+              <w:ind w:hanging="0" w:start="0" w:end="0"/>
               <w:jc w:val="start"/>
               <w:rPr/>
             </w:pPr>
@@ -101,94 +103,130 @@
                 <w:sz w:val="24"/>
                 <w:szCs w:val="24"/>
               </w:rPr>
-              <w:t>{{ title }}</w:t>
-            </w:r>
-            <w:r>
-              <w:rPr>
-                <w:rFonts w:ascii="Times New Roman" w:hAnsi="Times New Roman"/>
-                <w:b/>
-                <w:bCs/>
-                <w:sz w:val="20"/>
-                <w:szCs w:val="20"/>
-              </w:rPr>
-              <w:t xml:space="preserve"> | </w:t>
-            </w:r>
-            <w:r>
-              <w:rPr>
-                <w:rFonts w:ascii="Times New Roman" w:hAnsi="Times New Roman"/>
-                <w:b/>
-                <w:bCs/>
-                <w:sz w:val="24"/>
-                <w:szCs w:val="24"/>
-              </w:rPr>
-              <w:t>Spoken Languages</w:t>
-            </w:r>
-            <w:r>
-              <w:rPr>
-                <w:rFonts w:ascii="Times New Roman" w:hAnsi="Times New Roman"/>
-                <w:b/>
-                <w:bCs/>
-                <w:sz w:val="20"/>
-                <w:szCs w:val="20"/>
-              </w:rPr>
-              <w:t xml:space="preserve"> </w:t>
-            </w:r>
-            <w:r>
-              <w:rPr>
-                <w:rFonts w:ascii="Times New Roman" w:hAnsi="Times New Roman"/>
-                <w:b w:val="false"/>
-                <w:bCs w:val="false"/>
-                <w:sz w:val="20"/>
-                <w:szCs w:val="20"/>
-              </w:rPr>
-              <w:t>{{ languages | join(', ') }}</w:t>
-            </w:r>
-          </w:p>
-          <w:p>
-            <w:pPr>
-              <w:pStyle w:val="BodyText"/>
-              <w:widowControl/>
-              <w:suppressAutoHyphens w:val="true"/>
+              <w:t>Skills</w:t>
+            </w:r>
+          </w:p>
+          <w:p>
+            <w:pPr>
+              <w:pStyle w:val="BodyText"/>
               <w:bidi w:val="0"/>
               <w:spacing w:lineRule="auto" w:line="240" w:before="57" w:after="57"/>
               <w:ind w:hanging="0" w:start="0" w:end="0"/>
-              <w:jc w:val="both"/>
-              <w:rPr/>
-            </w:pPr>
-            <w:r>
-              <w:rPr>
-                <w:rFonts w:ascii="Times New Roman" w:hAnsi="Times New Roman"/>
-                <w:b/>
-                <w:bCs/>
-                <w:sz w:val="24"/>
-                <w:szCs w:val="24"/>
-              </w:rPr>
-              <w:t>Summary</w:t>
-            </w:r>
-            <w:r>
-              <w:rPr>
-                <w:rFonts w:ascii="Times New Roman" w:hAnsi="Times New Roman"/>
-                <w:b/>
-                <w:bCs/>
-                <w:sz w:val="20"/>
-                <w:szCs w:val="20"/>
-              </w:rPr>
-              <w:t xml:space="preserve"> </w:t>
-            </w:r>
-            <w:r>
-              <w:rPr>
-                <w:rFonts w:ascii="Times New Roman" w:hAnsi="Times New Roman"/>
-                <w:sz w:val="18"/>
-                <w:szCs w:val="18"/>
-              </w:rPr>
-              <w:t>{{ summary }}</w:t>
+              <w:jc w:val="start"/>
+              <w:rPr/>
+            </w:pPr>
+            <w:r>
+              <w:rPr>
+                <w:rFonts w:ascii="Times New Roman" w:hAnsi="Times New Roman"/>
+                <w:b/>
+                <w:bCs/>
+                <w:sz w:val="20"/>
+                <w:szCs w:val="20"/>
+              </w:rPr>
+              <w:t>Programming Languages</w:t>
+            </w:r>
+          </w:p>
+          <w:p>
+            <w:pPr>
+              <w:pStyle w:val="BodyText"/>
+              <w:bidi w:val="0"/>
+              <w:spacing w:lineRule="auto" w:line="240" w:before="57" w:after="57"/>
+              <w:jc w:val="start"/>
+              <w:rPr/>
+            </w:pPr>
+            <w:r>
+              <w:rPr>
+                <w:rFonts w:ascii="Times New Roman" w:hAnsi="Times New Roman"/>
+                <w:sz w:val="18"/>
+                <w:szCs w:val="18"/>
+              </w:rPr>
+              <w:t>{{ skills.programming_languages | join(', ') }}</w:t>
+            </w:r>
+          </w:p>
+          <w:p>
+            <w:pPr>
+              <w:pStyle w:val="BodyText"/>
+              <w:bidi w:val="0"/>
+              <w:spacing w:lineRule="auto" w:line="240" w:before="57" w:after="57"/>
+              <w:jc w:val="start"/>
+              <w:rPr/>
+            </w:pPr>
+            <w:r>
+              <w:rPr>
+                <w:rFonts w:ascii="Times New Roman" w:hAnsi="Times New Roman"/>
+                <w:b/>
+                <w:bCs/>
+                <w:sz w:val="20"/>
+                <w:szCs w:val="20"/>
+              </w:rPr>
+              <w:t>Technical</w:t>
+            </w:r>
+          </w:p>
+          <w:p>
+            <w:pPr>
+              <w:pStyle w:val="BodyText"/>
+              <w:bidi w:val="0"/>
+              <w:spacing w:lineRule="auto" w:line="240" w:before="57" w:after="57"/>
+              <w:jc w:val="start"/>
+              <w:rPr/>
+            </w:pPr>
+            <w:r>
+              <w:rPr>
+                <w:rFonts w:ascii="Times New Roman" w:hAnsi="Times New Roman"/>
+                <w:sz w:val="18"/>
+                <w:szCs w:val="18"/>
+              </w:rPr>
+              <w:t>{{ skills.technical_skills | join(', ') }}</w:t>
+            </w:r>
+          </w:p>
+          <w:p>
+            <w:pPr>
+              <w:pStyle w:val="BodyText"/>
+              <w:bidi w:val="0"/>
+              <w:spacing w:lineRule="auto" w:line="240" w:before="57" w:after="57"/>
+              <w:jc w:val="start"/>
+              <w:rPr/>
+            </w:pPr>
+            <w:r>
+              <w:rPr>
+                <w:rFonts w:ascii="Times New Roman" w:hAnsi="Times New Roman"/>
+                <w:b/>
+                <w:bCs/>
+                <w:sz w:val="20"/>
+                <w:szCs w:val="20"/>
+              </w:rPr>
+              <w:t>Soft</w:t>
+            </w:r>
+          </w:p>
+          <w:p>
+            <w:pPr>
+              <w:pStyle w:val="BodyText"/>
+              <w:bidi w:val="0"/>
+              <w:spacing w:lineRule="auto" w:line="240" w:before="57" w:after="57"/>
+              <w:jc w:val="start"/>
+              <w:rPr/>
+            </w:pPr>
+            <w:r>
+              <w:rPr>
+                <w:rFonts w:ascii="Times New Roman" w:hAnsi="Times New Roman"/>
+                <w:sz w:val="18"/>
+                <w:szCs w:val="18"/>
+              </w:rPr>
+              <w:t>{{ skills.soft_skills | join(', ') }</w:t>
+            </w:r>
+            <w:r>
+              <w:rPr>
+                <w:rFonts w:ascii="Times New Roman" w:hAnsi="Times New Roman"/>
+                <w:sz w:val="20"/>
+                <w:szCs w:val="20"/>
+              </w:rPr>
+              <w:t>}</w:t>
             </w:r>
           </w:p>
         </w:tc>
         <w:tc>
           <w:tcPr>
-            <w:tcW w:w="2730" w:type="dxa"/>
-            <w:vMerge w:val="restart"/>
+            <w:tcW w:w="8534" w:type="dxa"/>
             <w:tcBorders/>
           </w:tcPr>
           <w:p>
@@ -196,8 +234,7 @@
               <w:pStyle w:val="BodyText"/>
               <w:bidi w:val="0"/>
               <w:spacing w:lineRule="auto" w:line="240" w:before="57" w:after="57"/>
-              <w:ind w:hanging="0" w:start="0" w:end="0"/>
-              <w:jc w:val="end"/>
+              <w:jc w:val="both"/>
               <w:rPr/>
             </w:pPr>
             <w:r>
@@ -208,124 +245,87 @@
                 <w:sz w:val="24"/>
                 <w:szCs w:val="24"/>
               </w:rPr>
-              <w:t>Skills</w:t>
-            </w:r>
-          </w:p>
-          <w:p>
-            <w:pPr>
-              <w:pStyle w:val="BodyText"/>
+              <w:t>{{ title }}</w:t>
+            </w:r>
+            <w:r>
+              <w:rPr>
+                <w:rFonts w:ascii="Times New Roman" w:hAnsi="Times New Roman"/>
+                <w:b/>
+                <w:bCs/>
+                <w:sz w:val="20"/>
+                <w:szCs w:val="20"/>
+              </w:rPr>
+              <w:t xml:space="preserve"> | </w:t>
+            </w:r>
+            <w:r>
+              <w:rPr>
+                <w:rFonts w:ascii="Times New Roman" w:hAnsi="Times New Roman"/>
+                <w:b/>
+                <w:bCs/>
+                <w:sz w:val="24"/>
+                <w:szCs w:val="24"/>
+              </w:rPr>
+              <w:t>Spoken Languages</w:t>
+            </w:r>
+            <w:r>
+              <w:rPr>
+                <w:rFonts w:ascii="Times New Roman" w:hAnsi="Times New Roman"/>
+                <w:b/>
+                <w:bCs/>
+                <w:sz w:val="20"/>
+                <w:szCs w:val="20"/>
+              </w:rPr>
+              <w:t xml:space="preserve"> </w:t>
+            </w:r>
+            <w:r>
+              <w:rPr>
+                <w:rFonts w:ascii="Times New Roman" w:hAnsi="Times New Roman"/>
+                <w:b w:val="false"/>
+                <w:bCs w:val="false"/>
+                <w:sz w:val="20"/>
+                <w:szCs w:val="20"/>
+              </w:rPr>
+              <w:t>{{ languages | join(', ') }}</w:t>
+            </w:r>
+          </w:p>
+          <w:p>
+            <w:pPr>
+              <w:pStyle w:val="BodyText"/>
+              <w:widowControl/>
+              <w:suppressAutoHyphens w:val="true"/>
               <w:bidi w:val="0"/>
               <w:spacing w:lineRule="auto" w:line="240" w:before="57" w:after="57"/>
               <w:ind w:hanging="0" w:start="0" w:end="0"/>
-              <w:jc w:val="end"/>
-              <w:rPr/>
-            </w:pPr>
-            <w:r>
-              <w:rPr>
-                <w:rFonts w:ascii="Times New Roman" w:hAnsi="Times New Roman"/>
-                <w:b/>
-                <w:bCs/>
-                <w:sz w:val="20"/>
-                <w:szCs w:val="20"/>
-              </w:rPr>
-              <w:t>Programming Languages</w:t>
-            </w:r>
-          </w:p>
-          <w:p>
-            <w:pPr>
-              <w:pStyle w:val="BodyText"/>
-              <w:bidi w:val="0"/>
-              <w:spacing w:lineRule="auto" w:line="240" w:before="57" w:after="57"/>
-              <w:jc w:val="end"/>
-              <w:rPr/>
-            </w:pPr>
-            <w:r>
-              <w:rPr>
-                <w:rFonts w:ascii="Times New Roman" w:hAnsi="Times New Roman"/>
-                <w:sz w:val="18"/>
-                <w:szCs w:val="18"/>
-              </w:rPr>
-              <w:t>{{ skills.programming_languages | join(', ') }}</w:t>
-            </w:r>
-          </w:p>
-          <w:p>
-            <w:pPr>
-              <w:pStyle w:val="BodyText"/>
-              <w:bidi w:val="0"/>
-              <w:spacing w:lineRule="auto" w:line="240" w:before="57" w:after="57"/>
-              <w:jc w:val="end"/>
-              <w:rPr/>
-            </w:pPr>
-            <w:r>
-              <w:rPr>
-                <w:rFonts w:ascii="Times New Roman" w:hAnsi="Times New Roman"/>
-                <w:b/>
-                <w:bCs/>
-                <w:sz w:val="20"/>
-                <w:szCs w:val="20"/>
-              </w:rPr>
-              <w:t>Technical</w:t>
-            </w:r>
-          </w:p>
-          <w:p>
-            <w:pPr>
-              <w:pStyle w:val="BodyText"/>
-              <w:bidi w:val="0"/>
-              <w:spacing w:lineRule="auto" w:line="240" w:before="57" w:after="57"/>
-              <w:jc w:val="end"/>
-              <w:rPr/>
-            </w:pPr>
-            <w:r>
-              <w:rPr>
-                <w:rFonts w:ascii="Times New Roman" w:hAnsi="Times New Roman"/>
-                <w:sz w:val="18"/>
-                <w:szCs w:val="18"/>
-              </w:rPr>
-              <w:t>{{ skills.technical_skills | join(', ') }}</w:t>
-            </w:r>
-          </w:p>
-          <w:p>
-            <w:pPr>
-              <w:pStyle w:val="BodyText"/>
-              <w:bidi w:val="0"/>
-              <w:spacing w:lineRule="auto" w:line="240" w:before="57" w:after="57"/>
-              <w:jc w:val="end"/>
-              <w:rPr/>
-            </w:pPr>
-            <w:r>
-              <w:rPr>
-                <w:rFonts w:ascii="Times New Roman" w:hAnsi="Times New Roman"/>
-                <w:b/>
-                <w:bCs/>
-                <w:sz w:val="20"/>
-                <w:szCs w:val="20"/>
-              </w:rPr>
-              <w:t>Soft</w:t>
-            </w:r>
-          </w:p>
-          <w:p>
-            <w:pPr>
-              <w:pStyle w:val="BodyText"/>
-              <w:bidi w:val="0"/>
-              <w:spacing w:lineRule="auto" w:line="240" w:before="57" w:after="57"/>
-              <w:jc w:val="end"/>
-              <w:rPr/>
-            </w:pPr>
-            <w:r>
-              <w:rPr>
-                <w:rFonts w:ascii="Times New Roman" w:hAnsi="Times New Roman"/>
-                <w:sz w:val="18"/>
-                <w:szCs w:val="18"/>
-              </w:rPr>
-              <w:t>{{ skills.soft_skills | join(', ') }</w:t>
-            </w:r>
-            <w:r>
-              <w:rPr>
-                <w:rFonts w:ascii="Times New Roman" w:hAnsi="Times New Roman"/>
-                <w:sz w:val="20"/>
-                <w:szCs w:val="20"/>
-              </w:rPr>
-              <w:t>}</w:t>
+              <w:jc w:val="both"/>
+              <w:rPr/>
+            </w:pPr>
+            <w:r>
+              <w:rPr>
+                <w:rFonts w:ascii="Times New Roman" w:hAnsi="Times New Roman"/>
+                <w:b/>
+                <w:bCs/>
+                <w:sz w:val="24"/>
+                <w:szCs w:val="24"/>
+              </w:rPr>
+              <w:t>Summary</w:t>
+            </w:r>
+            <w:r>
+              <w:rPr>
+                <w:rFonts w:ascii="Times New Roman" w:hAnsi="Times New Roman"/>
+                <w:b/>
+                <w:bCs/>
+                <w:sz w:val="20"/>
+                <w:szCs w:val="20"/>
+              </w:rPr>
+              <w:t xml:space="preserve"> </w:t>
+            </w:r>
+            <w:r>
+              <w:rPr>
+                <w:rFonts w:ascii="Times New Roman" w:hAnsi="Times New Roman"/>
+                <w:sz w:val="18"/>
+                <w:szCs w:val="18"/>
+              </w:rPr>
+              <w:t>{{ summary }}</w:t>
             </w:r>
           </w:p>
         </w:tc>
@@ -336,7 +336,8 @@
         </w:trPr>
         <w:tc>
           <w:tcPr>
-            <w:tcW w:w="9149" w:type="dxa"/>
+            <w:tcW w:w="1980" w:type="dxa"/>
+            <w:vMerge w:val="continue"/>
             <w:tcBorders/>
           </w:tcPr>
           <w:p>
@@ -348,90 +349,13 @@
               <w:rPr/>
             </w:pPr>
             <w:r>
-              <w:rPr>
-                <w:rStyle w:val="Strong"/>
-                <w:rFonts w:ascii="Times New Roman" w:hAnsi="Times New Roman"/>
-                <w:sz w:val="24"/>
-                <w:szCs w:val="24"/>
-              </w:rPr>
-              <w:t>Education</w:t>
-            </w:r>
-            <w:r>
-              <w:rPr>
-                <w:rFonts w:ascii="Times New Roman" w:hAnsi="Times New Roman"/>
-                <w:sz w:val="20"/>
-                <w:szCs w:val="20"/>
-              </w:rPr>
-              <w:t> </w:t>
-            </w:r>
-            <w:r>
-              <w:rPr>
-                <w:rFonts w:ascii="Times New Roman" w:hAnsi="Times New Roman"/>
-                <w:sz w:val="18"/>
-                <w:szCs w:val="18"/>
-              </w:rPr>
-              <w:t>{% for edu in education %}</w:t>
-            </w:r>
-          </w:p>
-          <w:p>
-            <w:pPr>
-              <w:pStyle w:val="BodyText"/>
-              <w:bidi w:val="0"/>
-              <w:spacing w:lineRule="auto" w:line="240" w:before="57" w:after="57"/>
-              <w:jc w:val="start"/>
-              <w:rPr/>
-            </w:pPr>
-            <w:r>
-              <w:rPr>
-                <w:rFonts w:ascii="Times New Roman" w:hAnsi="Times New Roman"/>
-                <w:b/>
-                <w:bCs/>
-                <w:sz w:val="20"/>
-                <w:szCs w:val="20"/>
-              </w:rPr>
-              <w:t>{{ edu.degree }}</w:t>
-            </w:r>
-            <w:r>
-              <w:rPr>
-                <w:rFonts w:ascii="Times New Roman" w:hAnsi="Times New Roman"/>
-                <w:b/>
-                <w:bCs/>
-                <w:sz w:val="18"/>
-                <w:szCs w:val="18"/>
-              </w:rPr>
-              <w:t xml:space="preserve"> </w:t>
-            </w:r>
-            <w:r>
-              <w:rPr>
-                <w:rFonts w:ascii="Times New Roman" w:hAnsi="Times New Roman"/>
-                <w:sz w:val="18"/>
-                <w:szCs w:val="18"/>
-              </w:rPr>
-              <w:t xml:space="preserve">| {{ edu.university }} | {{ edu.location }} | {{ edu.duration }} </w:t>
-            </w:r>
-          </w:p>
-          <w:p>
-            <w:pPr>
-              <w:pStyle w:val="BodyText"/>
-              <w:bidi w:val="0"/>
-              <w:spacing w:lineRule="auto" w:line="240" w:before="57" w:after="57"/>
-              <w:jc w:val="start"/>
-              <w:rPr/>
-            </w:pPr>
-            <w:r>
-              <w:rPr>
-                <w:rFonts w:ascii="Times New Roman" w:hAnsi="Times New Roman"/>
-                <w:sz w:val="18"/>
-                <w:szCs w:val="18"/>
-              </w:rPr>
-              <w:t>Courses: {{ edu.courses | join(', ') }} {% endfor %}</w:t>
+              <w:rPr/>
             </w:r>
           </w:p>
         </w:tc>
         <w:tc>
           <w:tcPr>
-            <w:tcW w:w="2730" w:type="dxa"/>
-            <w:vMerge w:val="continue"/>
+            <w:tcW w:w="8534" w:type="dxa"/>
             <w:tcBorders/>
           </w:tcPr>
           <w:p>
@@ -439,18 +363,87 @@
               <w:pStyle w:val="BodyText"/>
               <w:bidi w:val="0"/>
               <w:spacing w:lineRule="auto" w:line="240" w:before="57" w:after="57"/>
-              <w:ind w:hanging="0" w:start="0" w:end="0"/>
-              <w:jc w:val="end"/>
-              <w:rPr>
+              <w:jc w:val="both"/>
+              <w:rPr/>
+            </w:pPr>
+            <w:r>
+              <w:rPr>
+                <w:rStyle w:val="Strong"/>
+                <w:rFonts w:ascii="Times New Roman" w:hAnsi="Times New Roman"/>
                 <w:sz w:val="24"/>
                 <w:szCs w:val="24"/>
               </w:rPr>
-            </w:pPr>
-            <w:r>
-              <w:rPr>
-                <w:sz w:val="24"/>
-                <w:szCs w:val="24"/>
-              </w:rPr>
+              <w:t>Education</w:t>
+            </w:r>
+            <w:r>
+              <w:rPr>
+                <w:rFonts w:ascii="Times New Roman" w:hAnsi="Times New Roman"/>
+                <w:sz w:val="20"/>
+                <w:szCs w:val="20"/>
+              </w:rPr>
+              <w:t> </w:t>
+            </w:r>
+            <w:r>
+              <w:rPr>
+                <w:rFonts w:ascii="Times New Roman" w:hAnsi="Times New Roman"/>
+                <w:sz w:val="18"/>
+                <w:szCs w:val="18"/>
+              </w:rPr>
+              <w:t>{% for edu in education %}</w:t>
+            </w:r>
+          </w:p>
+          <w:p>
+            <w:pPr>
+              <w:pStyle w:val="BodyText"/>
+              <w:bidi w:val="0"/>
+              <w:spacing w:lineRule="auto" w:line="240" w:before="57" w:after="57"/>
+              <w:jc w:val="both"/>
+              <w:rPr/>
+            </w:pPr>
+            <w:r>
+              <w:rPr>
+                <w:rFonts w:ascii="Times New Roman" w:hAnsi="Times New Roman"/>
+                <w:b/>
+                <w:bCs/>
+                <w:sz w:val="20"/>
+                <w:szCs w:val="20"/>
+              </w:rPr>
+              <w:t>{{ edu.degree }}</w:t>
+            </w:r>
+            <w:r>
+              <w:rPr>
+                <w:rFonts w:ascii="Times New Roman" w:hAnsi="Times New Roman"/>
+                <w:b/>
+                <w:bCs/>
+                <w:sz w:val="18"/>
+                <w:szCs w:val="18"/>
+              </w:rPr>
+              <w:t xml:space="preserve"> </w:t>
+            </w:r>
+            <w:r>
+              <w:rPr>
+                <w:rFonts w:ascii="Times New Roman" w:hAnsi="Times New Roman"/>
+                <w:sz w:val="18"/>
+                <w:szCs w:val="18"/>
+              </w:rPr>
+              <w:t xml:space="preserve">| {{ edu.university }} | {{ edu.location }} | {{ edu.duration }} </w:t>
+            </w:r>
+          </w:p>
+          <w:p>
+            <w:pPr>
+              <w:pStyle w:val="BodyText"/>
+              <w:bidi w:val="0"/>
+              <w:spacing w:lineRule="auto" w:line="240" w:before="57" w:after="57"/>
+              <w:jc w:val="both"/>
+              <w:rPr/>
+            </w:pPr>
+            <w:r>
+              <w:rPr>
+                <w:rFonts w:ascii="Times New Roman" w:hAnsi="Times New Roman"/>
+                <w:sz w:val="18"/>
+                <w:szCs w:val="18"/>
+              </w:rPr>
+              <w:t>Courses: {{ edu.courses | join(', ') }} {% endfor %}</w:t>
             </w:r>
           </w:p>
         </w:tc>
@@ -461,7 +454,8 @@
         </w:trPr>
         <w:tc>
           <w:tcPr>
-            <w:tcW w:w="9149" w:type="dxa"/>
+            <w:tcW w:w="1980" w:type="dxa"/>
+            <w:vMerge w:val="continue"/>
             <w:tcBorders/>
           </w:tcPr>
           <w:p>
@@ -473,73 +467,13 @@
               <w:rPr/>
             </w:pPr>
             <w:r>
-              <w:rPr>
-                <w:rStyle w:val="Strong"/>
-                <w:rFonts w:ascii="Times New Roman" w:hAnsi="Times New Roman"/>
-                <w:sz w:val="24"/>
-                <w:szCs w:val="24"/>
-              </w:rPr>
-              <w:t>Certifications</w:t>
-            </w:r>
-            <w:r>
-              <w:rPr>
-                <w:rFonts w:ascii="Times New Roman" w:hAnsi="Times New Roman"/>
-                <w:sz w:val="24"/>
-                <w:szCs w:val="24"/>
-              </w:rPr>
-              <w:t> </w:t>
-            </w:r>
-            <w:r>
-              <w:rPr>
-                <w:rFonts w:ascii="Times New Roman" w:hAnsi="Times New Roman"/>
-                <w:sz w:val="18"/>
-                <w:szCs w:val="18"/>
-              </w:rPr>
-              <w:t>{% for cert in certifications %}</w:t>
-            </w:r>
-          </w:p>
-          <w:p>
-            <w:pPr>
-              <w:pStyle w:val="BodyText"/>
-              <w:bidi w:val="0"/>
-              <w:spacing w:lineRule="auto" w:line="240" w:before="57" w:after="57"/>
-              <w:jc w:val="start"/>
-              <w:rPr/>
-            </w:pPr>
-            <w:r>
-              <w:rPr>
-                <w:rFonts w:ascii="Times New Roman" w:hAnsi="Times New Roman"/>
-                <w:b/>
-                <w:bCs/>
-                <w:sz w:val="20"/>
-                <w:szCs w:val="20"/>
-              </w:rPr>
-              <w:t>{{ cert.certification_name }}</w:t>
-            </w:r>
-            <w:r>
-              <w:rPr>
-                <w:rFonts w:ascii="Times New Roman" w:hAnsi="Times New Roman"/>
-                <w:b/>
-                <w:bCs/>
-                <w:sz w:val="20"/>
-                <w:szCs w:val="20"/>
-              </w:rPr>
-              <w:t xml:space="preserve"> </w:t>
-            </w:r>
-            <w:r>
-              <w:rPr>
-                <w:rFonts w:ascii="Times New Roman" w:hAnsi="Times New Roman"/>
-                <w:sz w:val="18"/>
-                <w:szCs w:val="18"/>
-              </w:rPr>
-              <w:t>{{ cert.issuing_organization }} | {{ cert.issue_date }} {% endfor %}</w:t>
+              <w:rPr/>
             </w:r>
           </w:p>
         </w:tc>
         <w:tc>
           <w:tcPr>
-            <w:tcW w:w="2730" w:type="dxa"/>
-            <w:vMerge w:val="continue"/>
+            <w:tcW w:w="8534" w:type="dxa"/>
             <w:tcBorders/>
           </w:tcPr>
           <w:p>
@@ -547,18 +481,60 @@
               <w:pStyle w:val="BodyText"/>
               <w:bidi w:val="0"/>
               <w:spacing w:lineRule="auto" w:line="240" w:before="57" w:after="57"/>
-              <w:ind w:hanging="0" w:start="0" w:end="0"/>
-              <w:jc w:val="end"/>
-              <w:rPr>
+              <w:jc w:val="both"/>
+              <w:rPr/>
+            </w:pPr>
+            <w:r>
+              <w:rPr>
+                <w:rStyle w:val="Strong"/>
+                <w:rFonts w:ascii="Times New Roman" w:hAnsi="Times New Roman"/>
                 <w:sz w:val="24"/>
                 <w:szCs w:val="24"/>
               </w:rPr>
-            </w:pPr>
-            <w:r>
-              <w:rPr>
+              <w:t>Certifications</w:t>
+            </w:r>
+            <w:r>
+              <w:rPr>
+                <w:rFonts w:ascii="Times New Roman" w:hAnsi="Times New Roman"/>
                 <w:sz w:val="24"/>
                 <w:szCs w:val="24"/>
               </w:rPr>
+              <w:t> </w:t>
+            </w:r>
+            <w:r>
+              <w:rPr>
+                <w:rFonts w:ascii="Times New Roman" w:hAnsi="Times New Roman"/>
+                <w:sz w:val="18"/>
+                <w:szCs w:val="18"/>
+              </w:rPr>
+              <w:t>{% for cert in certifications %}</w:t>
+            </w:r>
+          </w:p>
+          <w:p>
+            <w:pPr>
+              <w:pStyle w:val="BodyText"/>
+              <w:bidi w:val="0"/>
+              <w:spacing w:lineRule="auto" w:line="240" w:before="57" w:after="57"/>
+              <w:jc w:val="both"/>
+              <w:rPr/>
+            </w:pPr>
+            <w:r>
+              <w:rPr>
+                <w:rFonts w:ascii="Times New Roman" w:hAnsi="Times New Roman"/>
+                <w:b/>
+                <w:bCs/>
+                <w:sz w:val="20"/>
+                <w:szCs w:val="20"/>
+              </w:rPr>
+              <w:t xml:space="preserve">{{ cert.certification_name }} </w:t>
+            </w:r>
+            <w:r>
+              <w:rPr>
+                <w:rFonts w:ascii="Times New Roman" w:hAnsi="Times New Roman"/>
+                <w:sz w:val="18"/>
+                <w:szCs w:val="18"/>
+              </w:rPr>
+              <w:t>{{ cert.issuing_organization }} | {{ cert.issue_date }} {% endfor %}</w:t>
             </w:r>
           </w:p>
         </w:tc>
@@ -567,7 +543,8 @@
         <w:trPr/>
         <w:tc>
           <w:tcPr>
-            <w:tcW w:w="9149" w:type="dxa"/>
+            <w:tcW w:w="1980" w:type="dxa"/>
+            <w:vMerge w:val="continue"/>
             <w:tcBorders/>
           </w:tcPr>
           <w:p>
@@ -580,64 +557,13 @@
               <w:rPr/>
             </w:pPr>
             <w:r>
-              <w:rPr>
-                <w:rStyle w:val="Strong"/>
-                <w:rFonts w:ascii="Times New Roman" w:hAnsi="Times New Roman"/>
-                <w:sz w:val="24"/>
-                <w:szCs w:val="24"/>
-              </w:rPr>
-              <w:t>Awards and Scholarships</w:t>
-            </w:r>
-            <w:r>
-              <w:rPr>
-                <w:rFonts w:ascii="Times New Roman" w:hAnsi="Times New Roman"/>
-                <w:sz w:val="20"/>
-                <w:szCs w:val="20"/>
-              </w:rPr>
-              <w:t> </w:t>
-            </w:r>
-            <w:r>
-              <w:rPr>
-                <w:rFonts w:ascii="Times New Roman" w:hAnsi="Times New Roman"/>
-                <w:sz w:val="18"/>
-                <w:szCs w:val="18"/>
-              </w:rPr>
-              <w:t>{% for award in awards_and_scholarships %}</w:t>
-            </w:r>
-          </w:p>
-          <w:p>
-            <w:pPr>
-              <w:pStyle w:val="BodyText"/>
-              <w:bidi w:val="0"/>
-              <w:spacing w:lineRule="auto" w:line="240" w:before="57" w:after="57"/>
-              <w:ind w:hanging="0" w:start="0" w:end="0"/>
-              <w:jc w:val="start"/>
-              <w:rPr/>
-            </w:pPr>
-            <w:r>
-              <w:rPr>
-                <w:rFonts w:ascii="Times New Roman" w:hAnsi="Times New Roman"/>
-                <w:b/>
-                <w:bCs/>
-                <w:sz w:val="20"/>
-                <w:szCs w:val="20"/>
-              </w:rPr>
-              <w:t>{{ award.award_name }}</w:t>
-            </w:r>
-            <w:r>
-              <w:rPr>
-                <w:rFonts w:ascii="Times New Roman" w:hAnsi="Times New Roman"/>
-                <w:sz w:val="18"/>
-                <w:szCs w:val="18"/>
-              </w:rPr>
-              <w:t xml:space="preserve"> | {{ award.issuing_organization }} | {{ award.issue_date }} {% endfor %}</w:t>
+              <w:rPr/>
             </w:r>
           </w:p>
         </w:tc>
         <w:tc>
           <w:tcPr>
-            <w:tcW w:w="2730" w:type="dxa"/>
-            <w:vMerge w:val="continue"/>
+            <w:tcW w:w="8534" w:type="dxa"/>
             <w:tcBorders/>
           </w:tcPr>
           <w:p>
@@ -645,19 +571,62 @@
               <w:pStyle w:val="BodyText"/>
               <w:bidi w:val="0"/>
               <w:spacing w:lineRule="auto" w:line="240" w:before="57" w:after="57"/>
-              <w:jc w:val="end"/>
-              <w:rPr>
-                <w:rFonts w:ascii="Times New Roman" w:hAnsi="Times New Roman"/>
-                <w:sz w:val="20"/>
-                <w:szCs w:val="20"/>
-              </w:rPr>
-            </w:pPr>
-            <w:r>
-              <w:rPr>
-                <w:rFonts w:ascii="Times New Roman" w:hAnsi="Times New Roman"/>
-                <w:sz w:val="20"/>
-                <w:szCs w:val="20"/>
-              </w:rPr>
+              <w:ind w:hanging="0" w:start="0" w:end="0"/>
+              <w:jc w:val="both"/>
+              <w:rPr/>
+            </w:pPr>
+            <w:r>
+              <w:rPr>
+                <w:rStyle w:val="Strong"/>
+                <w:rFonts w:ascii="Times New Roman" w:hAnsi="Times New Roman"/>
+                <w:sz w:val="24"/>
+                <w:szCs w:val="24"/>
+              </w:rPr>
+              <w:t>Awards and Scholarships</w:t>
+            </w:r>
+            <w:r>
+              <w:rPr>
+                <w:rFonts w:ascii="Times New Roman" w:hAnsi="Times New Roman"/>
+                <w:sz w:val="20"/>
+                <w:szCs w:val="20"/>
+              </w:rPr>
+              <w:t> </w:t>
+            </w:r>
+            <w:r>
+              <w:rPr>
+                <w:rFonts w:ascii="Times New Roman" w:hAnsi="Times New Roman"/>
+                <w:sz w:val="18"/>
+                <w:szCs w:val="18"/>
+              </w:rPr>
+              <w:t>{% for award in awards_and_scholarships %}</w:t>
+            </w:r>
+          </w:p>
+          <w:p>
+            <w:pPr>
+              <w:pStyle w:val="BodyText"/>
+              <w:bidi w:val="0"/>
+              <w:spacing w:lineRule="auto" w:line="240" w:before="57" w:after="57"/>
+              <w:ind w:hanging="0" w:start="0" w:end="0"/>
+              <w:jc w:val="both"/>
+              <w:rPr/>
+            </w:pPr>
+            <w:r>
+              <w:rPr>
+                <w:rFonts w:ascii="Times New Roman" w:hAnsi="Times New Roman"/>
+                <w:b/>
+                <w:bCs/>
+                <w:sz w:val="20"/>
+                <w:szCs w:val="20"/>
+              </w:rPr>
+              <w:t>{{ award.award_name }}</w:t>
+            </w:r>
+            <w:r>
+              <w:rPr>
+                <w:rFonts w:ascii="Times New Roman" w:hAnsi="Times New Roman"/>
+                <w:sz w:val="18"/>
+                <w:szCs w:val="18"/>
+              </w:rPr>
+              <w:t xml:space="preserve"> | {{ award.issuing_organization }} | {{ award.issue_date }} {% endfor %}</w:t>
             </w:r>
           </w:p>
         </w:tc>
@@ -666,7 +635,7 @@
         <w:trPr/>
         <w:tc>
           <w:tcPr>
-            <w:tcW w:w="11879" w:type="dxa"/>
+            <w:tcW w:w="10514" w:type="dxa"/>
             <w:gridSpan w:val="2"/>
             <w:tcBorders/>
           </w:tcPr>
@@ -758,7 +727,7 @@
         <w:trPr/>
         <w:tc>
           <w:tcPr>
-            <w:tcW w:w="11879" w:type="dxa"/>
+            <w:tcW w:w="10514" w:type="dxa"/>
             <w:gridSpan w:val="2"/>
             <w:tcBorders/>
           </w:tcPr>
@@ -847,12 +816,10 @@
         </w:tc>
       </w:tr>
       <w:tr>
-        <w:trPr>
-          <w:trHeight w:val="1129" w:hRule="atLeast"/>
-        </w:trPr>
+        <w:trPr/>
         <w:tc>
           <w:tcPr>
-            <w:tcW w:w="11879" w:type="dxa"/>
+            <w:tcW w:w="10514" w:type="dxa"/>
             <w:gridSpan w:val="2"/>
             <w:tcBorders/>
           </w:tcPr>
@@ -1307,8 +1274,8 @@
       <w:bCs/>
     </w:rPr>
   </w:style>
-  <w:style w:type="character" w:styleId="Bulletsuser">
-    <w:name w:val="Bullets (user)"/>
+  <w:style w:type="character" w:styleId="Bullets">
+    <w:name w:val="Bullets"/>
     <w:qFormat/>
     <w:rPr>
       <w:rFonts w:ascii="OpenSymbol" w:hAnsi="OpenSymbol" w:eastAsia="OpenSymbol" w:cs="OpenSymbol"/>
@@ -1319,8 +1286,8 @@
     <w:qFormat/>
     <w:rPr/>
   </w:style>
-  <w:style w:type="character" w:styleId="Bullets">
-    <w:name w:val="Bullets"/>
+  <w:style w:type="character" w:styleId="Bulletsuser">
+    <w:name w:val="Bullets (user)"/>
     <w:qFormat/>
     <w:rPr>
       <w:rFonts w:ascii="OpenSymbol" w:hAnsi="OpenSymbol" w:eastAsia="OpenSymbol" w:cs="OpenSymbol"/>

</xml_diff>